<commit_message>
feat(resume): add 2-column ATS PDF option, project links, AWS skill
</commit_message>
<xml_diff>
--- a/generated/en/docx/frontend.docx
+++ b/generated/en/docx/frontend.docx
@@ -258,6 +258,18 @@
     </w:p>
     <w:p>
       <w:pPr>
+        <w:spacing w:after="80"/>
+      </w:pPr>
+      <w:r>
+        <w:rPr>
+          <w:i w:val="false"/>
+          <w:iCs w:val="false"/>
+        </w:rPr>
+        <w:t xml:space="preserve">Links: Live (https://memory.inbytes.xyz)</w:t>
+      </w:r>
+    </w:p>
+    <w:p>
+      <w:pPr>
         <w:pStyle w:val="Heading2"/>
         <w:spacing w:after="80" w:before="240"/>
       </w:pPr>
@@ -287,6 +299,18 @@
           <w:iCs w:val="false"/>
         </w:rPr>
         <w:t xml:space="preserve">React · TypeScript · Cloudflare Workers</w:t>
+      </w:r>
+    </w:p>
+    <w:p>
+      <w:pPr>
+        <w:spacing w:after="80"/>
+      </w:pPr>
+      <w:r>
+        <w:rPr>
+          <w:i w:val="false"/>
+          <w:iCs w:val="false"/>
+        </w:rPr>
+        <w:t xml:space="preserve">Links: Live (https://ai.digitalerror.xyz) · Source (https://github.com/orozcoh/prompter)</w:t>
       </w:r>
     </w:p>
     <w:p>

</xml_diff>